<commit_message>
Soknadspakke, rekruttering og presseopplegg rettet etter kildekontrollen
Co-Authored-By: Claude Opus 5 <noreply@anthropic.com>
</commit_message>
<xml_diff>
--- a/Presseopplegg.docx
+++ b/Presseopplegg.docx
@@ -665,7 +665,7 @@
                 <w:i w:val="0"/>
                 <w:color w:val="14532D"/>
               </w:rPr>
-              <w:t>Gjelder høsten 2026: puljen og søknaden er to prosjekter</w:t>
+              <w:t>Regelen som styrer forholdet mellom pulje og søknad</w:t>
             </w:r>
           </w:p>
           <w:p>
@@ -678,7 +678,7 @@
                 <w:i w:val="0"/>
                 <w:color w:val="14532D"/>
               </w:rPr>
-              <w:t xml:space="preserve">Datoene i dette opplegget forutsetter at klubben kjører en pulje. </w:t>
+              <w:t xml:space="preserve">Gjensidigestiftelsen oppgir at </w:t>
             </w:r>
             <w:r>
               <w:rPr>
@@ -686,7 +686,15 @@
                 <w:i w:val="0"/>
                 <w:color w:val="14532D"/>
               </w:rPr>
-              <w:t>I 2026 må dere vite hva den puljen gjør med søknaden før dere annonserer den.</w:t>
+              <w:t>første mulige startdato er 1. desember i søknadsåret</w:t>
+            </w:r>
+            <w:r>
+              <w:rPr>
+                <w:b w:val="0"/>
+                <w:i w:val="0"/>
+                <w:color w:val="14532D"/>
+              </w:rPr>
+              <w:t>. Et opplegg som alt er i gang når dere søker, er derfor ikke det dere kan søke på.</w:t>
             </w:r>
           </w:p>
           <w:p>
@@ -699,36 +707,7 @@
                 <w:i w:val="0"/>
                 <w:color w:val="14532D"/>
               </w:rPr>
-              <w:t xml:space="preserve">Gjensidigestiftelsen har frist 1. september 2026, og </w:t>
-            </w:r>
-            <w:r>
-              <w:rPr>
-                <w:b/>
-                <w:i w:val="0"/>
-                <w:color w:val="14532D"/>
-              </w:rPr>
-              <w:t>allerede igangsatte prosjekter støttes ikke.</w:t>
-            </w:r>
-            <w:r>
-              <w:rPr>
-                <w:b w:val="0"/>
-                <w:i w:val="0"/>
-                <w:color w:val="14532D"/>
-              </w:rPr>
-              <w:t xml:space="preserve"> Kjører klubben høstpuljen og søker om midler til det samme opplegget, er prosjektet i gang — og søknaden faller.</w:t>
-            </w:r>
-          </w:p>
-          <w:p>
-            <w:pPr>
-              <w:spacing w:before="100" w:after="100"/>
-            </w:pPr>
-            <w:r>
-              <w:rPr>
-                <w:b w:val="0"/>
-                <w:i w:val="0"/>
-                <w:color w:val="14532D"/>
-              </w:rPr>
-              <w:t xml:space="preserve">Vil dere likevel kjøre en pulje i høst, </w:t>
+              <w:t xml:space="preserve">Vil dere kjøre en pulje nå, </w:t>
             </w:r>
             <w:r>
               <w:rPr>
@@ -744,7 +723,28 @@
                 <w:i w:val="0"/>
                 <w:color w:val="14532D"/>
               </w:rPr>
-              <w:t>, og send pressesaken som normalt. Søknaden 1. september gjelder tilbudet fra 2027 og framover.</w:t>
+              <w:t>, og søk Gjensidigestiftelsen på neste pulje. Pengekildeoversikten for klubben viser hva som er åpent. Pressesaken sendes som normalt.</w:t>
+            </w:r>
+          </w:p>
+          <w:p>
+            <w:pPr>
+              <w:spacing w:before="100" w:after="100"/>
+            </w:pPr>
+            <w:r>
+              <w:rPr>
+                <w:b/>
+                <w:i w:val="0"/>
+                <w:color w:val="14532D"/>
+              </w:rPr>
+              <w:t>Oppdatert 14.09.2026:</w:t>
+            </w:r>
+            <w:r>
+              <w:rPr>
+                <w:b w:val="0"/>
+                <w:i w:val="0"/>
+                <w:color w:val="14532D"/>
+              </w:rPr>
+              <w:t xml:space="preserve"> fristen 1. september 2026 er passert, og ingen 2027-utlysning er publisert ennå.</w:t>
             </w:r>
           </w:p>
           <w:p>

</xml_diff>